<commit_message>
docs(챗봇설계서): Claude → Gemini 정정
개별 챗봇 설계서(docx/pdf)의 LLM 엔진 표기를 현행 Gemini로 정정(6곳):
부제·본문 'Claude(LLM) API'→'Gemini(LLM) API', 'Claude Messages API
(api.anthropic.com)'→'Gemini API (generativelanguage.googleapis.com)',
'ANTHROPIC_MODEL(claude-haiku-4-5)'→'GEMINI_MODEL(gemini-2.5-flash)',
'ANTHROPIC_API_KEY 미설정→폴백'→'LLM_PROVIDER=gemini·운영 중'. 도메인
aiclaude.kr은 보존. 챗봇 PDF·병합 PDF(19p) 재생성.

Co-Authored-By: Claude Opus 4.8 (1M context) <noreply@anthropic.com>
</commit_message>
<xml_diff>
--- a/CareAnd-AI-챗봇-설계서.docx
+++ b/CareAnd-AI-챗봇-설계서.docx
@@ -62,13 +62,7 @@
         <w:spacing w:after="80" w:line="276" w:lineRule="auto"/>
       </w:pPr>
       <w:r>
-        <w:rPr>
-          <w:rFonts w:ascii="맑은 고딕" w:hAnsi="맑은 고딕" w:eastAsia="맑은 고딕"/>
-          <w:color w:val="666666"/>
-          <w:sz w:val="22"/>
-          <w:szCs w:val="22"/>
-        </w:rPr>
-        <w:t xml:space="preserve">상담 챗봇 + 산후조리 챗봇 (Claude LLM + 폴백)</w:t>
+        <w:t>상담 챗봇 + 산후조리 챗봇 (Gemini LLM + 폴백)</w:t>
       </w:r>
     </w:p>
     <w:p>
@@ -102,10 +96,7 @@
         <w:spacing w:after="120" w:line="276" w:lineRule="auto"/>
       </w:pPr>
       <w:r>
-        <w:rPr>
-          <w:rFonts w:ascii="맑은 고딕" w:hAnsi="맑은 고딕" w:eastAsia="맑은 고딕"/>
-        </w:rPr>
-        <w:t xml:space="preserve">Care&amp; 챗봇은 (1) 장기요양·돌봄 일반 상담 챗봇과 (2) 산후조리 전문 챗봇 두 가지를 제공한다. 둘 다 Claude(LLM) API로 답변을 생성하되, API 키 미설정·호출 실패 시 안전한 폴백(지식베이스 안내문/규칙 기반 답변)으로 대체하여 항상 응답한다.</w:t>
+        <w:t>Care&amp; 챗봇은 (1) 장기요양·돌봄 일반 상담 챗봇과 (2) 산후조리 전문 챗봇 두 가지를 제공한다. 둘 다 Gemini(LLM) API로 답변을 생성하되, API 키 미설정·호출 실패 시 안전한 폴백(지식베이스 안내문/규칙 기반 답변)으로 대체하여 항상 응답한다.</w:t>
       </w:r>
     </w:p>
     <w:p>
@@ -212,16 +203,8 @@
             <w:vAlign w:val="center"/>
           </w:tcPr>
           <w:p>
-            <w:pPr>
-              <w:spacing w:after="20" w:line="252" w:lineRule="auto"/>
-            </w:pPr>
-            <w:r>
-              <w:rPr>
-                <w:rFonts w:ascii="맑은 고딕" w:hAnsi="맑은 고딕" w:eastAsia="맑은 고딕"/>
-                <w:sz w:val="18"/>
-                <w:szCs w:val="18"/>
-              </w:rPr>
-              <w:t xml:space="preserve">Claude Messages API (api.anthropic.com)</w:t>
+            <w:r>
+              <w:t>Gemini API (generativelanguage.googleapis.com)</w:t>
             </w:r>
           </w:p>
         </w:tc>
@@ -252,16 +235,8 @@
             <w:vAlign w:val="center"/>
           </w:tcPr>
           <w:p>
-            <w:pPr>
-              <w:spacing w:after="20" w:line="252" w:lineRule="auto"/>
-            </w:pPr>
-            <w:r>
-              <w:rPr>
-                <w:rFonts w:ascii="맑은 고딕" w:hAnsi="맑은 고딕" w:eastAsia="맑은 고딕"/>
-                <w:sz w:val="18"/>
-                <w:szCs w:val="18"/>
-              </w:rPr>
-              <w:t xml:space="preserve">ANTHROPIC_MODEL (기본 claude-haiku-4-5)</w:t>
+            <w:r>
+              <w:t>GEMINI_MODEL (기본 gemini-2.5-flash)</w:t>
             </w:r>
           </w:p>
         </w:tc>
@@ -372,16 +347,8 @@
             <w:vAlign w:val="center"/>
           </w:tcPr>
           <w:p>
-            <w:pPr>
-              <w:spacing w:after="20" w:line="252" w:lineRule="auto"/>
-            </w:pPr>
-            <w:r>
-              <w:rPr>
-                <w:rFonts w:ascii="맑은 고딕" w:hAnsi="맑은 고딕" w:eastAsia="맑은 고딕"/>
-                <w:sz w:val="18"/>
-                <w:szCs w:val="18"/>
-              </w:rPr>
-              <w:t xml:space="preserve">ANTHROPIC_API_KEY 미설정 → 폴백 동작 중</w:t>
+            <w:r>
+              <w:t>LLM_PROVIDER=gemini · 운영 중</w:t>
             </w:r>
           </w:p>
         </w:tc>
@@ -836,10 +803,7 @@
         <w:spacing w:after="60" w:line="276" w:lineRule="auto"/>
       </w:pPr>
       <w:r>
-        <w:rPr>
-          <w:rFonts w:ascii="맑은 고딕" w:hAnsi="맑은 고딕" w:eastAsia="맑은 고딕"/>
-        </w:rPr>
-        <w:t xml:space="preserve">•  현재 ANTHROPIC_API_KEY 미설정으로 폴백 동작 — 키 주입 시 LLM 답변 활성화.</w:t>
+        <w:t>•  현재 LLM_PROVIDER=gemini로 Gemini 답변 활성(운영). 키 미설정·호출 실패 시 안전 폴백.</w:t>
       </w:r>
     </w:p>
     <w:p>

</xml_diff>